<commit_message>
Add wiki_kb system, user project RAG, LibreOffice for .doc support, per-role session generation
- wiki_kb: full Karpathy RAG pipeline (ingest, corpus analysis, compile, index, ask)
- Library: integrated wiki query chatbot + user project upload/rebuild workflow
- Dashboard: PM can trigger per-engineer session generation (process/mechanical independently)
- server.js: user project CRUD, file management, rebuild, role-filtered suggest-sessions
- Dockerfile/nixpacks: add libreoffice-writer for .doc → .docx conversion on Railway
- .gitignore: exclude node_modules, user_projects, wiki_kb/db, parsed caches

Made-with: Cursor
</commit_message>
<xml_diff>
--- a/work_agents/Aria - Process Engineer/deliverables/1-CAL-XXXX.docx
+++ b/work_agents/Aria - Process Engineer/deliverables/1-CAL-XXXX.docx
@@ -27,7 +27,7 @@
     </w:p>
     <w:p>
       <w:r>
-        <w:t>Prepared By: Process Engineer</w:t>
+        <w:t>Prepared By: [Your Name/Process Engineer]</w:t>
       </w:r>
     </w:p>
     <w:p>
@@ -40,7 +40,7 @@
     </w:p>
     <w:p>
       <w:r>
-        <w:t>This document summarizes the key process and hydraulic calculations for the Monoethylene Glycol (MEG) Transfer Pump Skid. It outlines the fluid properties, design criteria, hydraulic performance requirements, and relevant engineering considerations to guide the subsequent mechanical design and procurement phases of the project.</w:t>
+        <w:t>This document summarizes the process calculations for the Monoethylene Glycol (MEG) Transfer Pump Skid at B Star Chemetics' Sarnia facility. It covers fluid properties, design criteria, hydraulic calculations, risk considerations, and key parameters for mechanical engineering handover, ensuring the pump is appropriately sized and specified for its intended service.</w:t>
       </w:r>
     </w:p>
     <w:p>
@@ -56,7 +56,15 @@
         <w:pStyle w:val="ListBullet"/>
       </w:pPr>
       <w:r>
-        <w:t xml:space="preserve">  Fluid: Monoethylene Glycol (MEG), 95% by weight (code: MEG)</w:t>
+        <w:t xml:space="preserve">  Fluid: Monoethylene Glycol (MEG), 95% by weight</w:t>
+      </w:r>
+    </w:p>
+    <w:p>
+      <w:pPr>
+        <w:pStyle w:val="ListBullet"/>
+      </w:pPr>
+      <w:r>
+        <w:t xml:space="preserve">  Code: MEG</w:t>
       </w:r>
     </w:p>
     <w:p>
@@ -68,11 +76,227 @@
       </w:r>
     </w:p>
     <w:p>
+      <w:r>
+        <w:t>Fluid Properties:</w:t>
+      </w:r>
+    </w:p>
+    <w:p>
       <w:pPr>
         <w:pStyle w:val="ListBullet"/>
       </w:pPr>
       <w:r>
-        <w:t xml:space="preserve">  Properties:</w:t>
+        <w:t xml:space="preserve">  Density: 1095 kg/m³ (Specific Gravity: 1.095)</w:t>
+      </w:r>
+    </w:p>
+    <w:p>
+      <w:pPr>
+        <w:pStyle w:val="ListBullet"/>
+      </w:pPr>
+      <w:r>
+        <w:t xml:space="preserve">  Viscosity: 2.5 mPa·s</w:t>
+      </w:r>
+    </w:p>
+    <w:p>
+      <w:pPr>
+        <w:pStyle w:val="ListBullet"/>
+      </w:pPr>
+      <w:r>
+        <w:t xml:space="preserve">  Vapour Pressure at 65°C: 0.2 kPa</w:t>
+      </w:r>
+    </w:p>
+    <w:p>
+      <w:pPr>
+        <w:pStyle w:val="ListBullet"/>
+      </w:pPr>
+      <w:r>
+        <w:t xml:space="preserve">  Corrosive: False</w:t>
+      </w:r>
+    </w:p>
+    <w:p>
+      <w:r>
+        <w:t>Engineering Significance:</w:t>
+      </w:r>
+    </w:p>
+    <w:p>
+      <w:r>
+        <w:t>The fluid's density is critical for converting head to pressure and for power calculations. The low viscosity (2.5 mPa·s) indicates that standard centrifugal pumps are suitable without significant derating due to viscous effects. The low vapour pressure (0.2 kPa at 65°C) is favorable for Net Positive Suction Head Available (NPSHa) calculations, minimizing the risk of cavitation. The non-corrosive nature simplifies material selection, allowing for standard industrial materials.</w:t>
+      </w:r>
+    </w:p>
+    <w:p>
+      <w:pPr>
+        <w:pStyle w:val="Heading3"/>
+      </w:pPr>
+      <w:r>
+        <w:t>3. Design Criteria Summary</w:t>
+      </w:r>
+    </w:p>
+    <w:p>
+      <w:pPr>
+        <w:pStyle w:val="ListBullet"/>
+      </w:pPr>
+      <w:r>
+        <w:t xml:space="preserve">  Normal Flow: 45 m³/h</w:t>
+      </w:r>
+    </w:p>
+    <w:p>
+      <w:pPr>
+        <w:pStyle w:val="ListBullet"/>
+      </w:pPr>
+      <w:r>
+        <w:t xml:space="preserve">  Rated Flow: 54.0 m³/h (A 20% margin has been applied to the normal flow to determine the rated flow.)</w:t>
+      </w:r>
+    </w:p>
+    <w:p>
+      <w:pPr>
+        <w:pStyle w:val="ListBullet"/>
+      </w:pPr>
+      <w:r>
+        <w:t xml:space="preserve">  Source for margin: 4-PDS-XXXX-R1 (Template Brine Ion Exchange Pkg).xls</w:t>
+      </w:r>
+    </w:p>
+    <w:p>
+      <w:pPr>
+        <w:pStyle w:val="ListBullet"/>
+      </w:pPr>
+      <w:r>
+        <w:t xml:space="preserve">  Design Pressure: 10 bar (PN10)</w:t>
+      </w:r>
+    </w:p>
+    <w:p>
+      <w:pPr>
+        <w:pStyle w:val="ListBullet"/>
+      </w:pPr>
+      <w:r>
+        <w:t xml:space="preserve">  Corrosion Allowance: 1.5 mm</w:t>
+      </w:r>
+    </w:p>
+    <w:p>
+      <w:pPr>
+        <w:pStyle w:val="ListBullet"/>
+      </w:pPr>
+      <w:r>
+        <w:t xml:space="preserve">  Source for corrosion allowance: 5-LST-0003</w:t>
+      </w:r>
+    </w:p>
+    <w:p>
+      <w:pPr>
+        <w:pStyle w:val="ListBullet"/>
+      </w:pPr>
+      <w:r>
+        <w:t xml:space="preserve">  Material Requirements: No specific corrosive material requirement is indicated, as the 'corrosive_fluid' flag is not active. Standard materials suitable for MEG are acceptable.</w:t>
+      </w:r>
+    </w:p>
+    <w:p>
+      <w:pPr>
+        <w:pStyle w:val="ListBullet"/>
+      </w:pPr>
+      <w:r>
+        <w:t xml:space="preserve">  Pressure Test Requirements: No mandatory hydrostatic test requirement is indicated, as the 'high_pressure' flag is not active.</w:t>
+      </w:r>
+    </w:p>
+    <w:p>
+      <w:pPr>
+        <w:pStyle w:val="ListBullet"/>
+      </w:pPr>
+      <w:r>
+        <w:t xml:space="preserve">  Source for design criteria: RAG / 1-PRC-0001</w:t>
+      </w:r>
+    </w:p>
+    <w:p>
+      <w:pPr>
+        <w:pStyle w:val="Heading3"/>
+      </w:pPr>
+      <w:r>
+        <w:t>4. Hydraulic Calculation</w:t>
+      </w:r>
+    </w:p>
+    <w:p>
+      <w:r>
+        <w:t>Total Dynamic Head (TDH) Breakdown:</w:t>
+      </w:r>
+    </w:p>
+    <w:p>
+      <w:pPr>
+        <w:pStyle w:val="ListBullet"/>
+      </w:pPr>
+      <w:r>
+        <w:t xml:space="preserve">  Pressure Differential Head: 15.8 m</w:t>
+      </w:r>
+    </w:p>
+    <w:p>
+      <w:pPr>
+        <w:pStyle w:val="ListBullet"/>
+      </w:pPr>
+      <w:r>
+        <w:t xml:space="preserve">  Static Head: 5 m</w:t>
+      </w:r>
+    </w:p>
+    <w:p>
+      <w:pPr>
+        <w:pStyle w:val="ListBullet"/>
+      </w:pPr>
+      <w:r>
+        <w:t xml:space="preserve">  Friction Losses: 3.3 m</w:t>
+      </w:r>
+    </w:p>
+    <w:p>
+      <w:pPr>
+        <w:pStyle w:val="ListBullet"/>
+      </w:pPr>
+      <w:r>
+        <w:t xml:space="preserve">  Total Dynamic Head (TDH): 24.1 m</w:t>
+      </w:r>
+    </w:p>
+    <w:p>
+      <w:r>
+        <w:t>Net Positive Suction Head Available (NPSHa):</w:t>
+      </w:r>
+    </w:p>
+    <w:p>
+      <w:pPr>
+        <w:pStyle w:val="ListBullet"/>
+      </w:pPr>
+      <w:r>
+        <w:t xml:space="preserve">  NPSHa: 25.6 m</w:t>
+      </w:r>
+    </w:p>
+    <w:p>
+      <w:r>
+        <w:t>Notes: No specific notes or unusual conditions were identified during the hydraulic calculation.</w:t>
+      </w:r>
+    </w:p>
+    <w:p>
+      <w:pPr>
+        <w:pStyle w:val="Heading3"/>
+      </w:pPr>
+      <w:r>
+        <w:t>5. Risk Considerations</w:t>
+      </w:r>
+    </w:p>
+    <w:p>
+      <w:r>
+        <w:t>No active risk flags were identified for this project based on the provided data. This implies that no specific engineering mitigations (e.g., special material requirements for corrosion, specific high-pressure testing protocols, or unique safety interlocks) are triggered by inherent fluid properties or operating conditions beyond standard industrial practices.</w:t>
+      </w:r>
+    </w:p>
+    <w:p>
+      <w:pPr>
+        <w:pStyle w:val="Heading3"/>
+      </w:pPr>
+      <w:r>
+        <w:t>6. Handover to Mechanical Engineer</w:t>
+      </w:r>
+    </w:p>
+    <w:p>
+      <w:r>
+        <w:t>The following parameters are to be used by the Mechanical Engineer for the selection and design of the MEG Transfer Pump:</w:t>
+      </w:r>
+    </w:p>
+    <w:p>
+      <w:pPr>
+        <w:pStyle w:val="ListBullet"/>
+      </w:pPr>
+      <w:r>
+        <w:t xml:space="preserve">  Fluid: Monoethylene Glycol (MEG)</w:t>
       </w:r>
     </w:p>
     <w:p>
@@ -88,7 +312,7 @@
         <w:pStyle w:val="ListBullet"/>
       </w:pPr>
       <w:r>
-        <w:t xml:space="preserve">  Specific Gravity (SG): 1.095</w:t>
+        <w:t xml:space="preserve">  Viscosity: 2.5 mPa·s</w:t>
       </w:r>
     </w:p>
     <w:p>
@@ -96,7 +320,7 @@
         <w:pStyle w:val="ListBullet"/>
       </w:pPr>
       <w:r>
-        <w:t xml:space="preserve">  Viscosity: 4.0 mPa·s</w:t>
+        <w:t xml:space="preserve">  Vapour Pressure: 0.2 kPa (at 65°C)</w:t>
       </w:r>
     </w:p>
     <w:p>
@@ -104,262 +328,7 @@
         <w:pStyle w:val="ListBullet"/>
       </w:pPr>
       <w:r>
-        <w:t xml:space="preserve">  Vapour Pressure at 65°C: 0.5 kPa</w:t>
-      </w:r>
-    </w:p>
-    <w:p>
-      <w:pPr>
-        <w:pStyle w:val="ListBullet"/>
-      </w:pPr>
-      <w:r>
-        <w:t xml:space="preserve">  Corrosive: True</w:t>
-      </w:r>
-    </w:p>
-    <w:p>
-      <w:pPr>
-        <w:pStyle w:val="ListBullet"/>
-      </w:pPr>
-      <w:r>
-        <w:t xml:space="preserve">  Engineering Significance: The fluid's corrosivity (MEG, 95% wt) is a critical factor for material selection, necessitating the use of corrosion-resistant materials for all wetted parts of the pump and associated piping. The low vapour pressure at 65°C indicates a reduced risk of cavitation from this property alone, but NPSHa must still be confirmed.</w:t>
-      </w:r>
-    </w:p>
-    <w:p>
-      <w:pPr>
-        <w:pStyle w:val="Heading3"/>
-      </w:pPr>
-      <w:r>
-        <w:t>3. Design Criteria Summary</w:t>
-      </w:r>
-    </w:p>
-    <w:p>
-      <w:r>
-        <w:t>The following design criteria have been established for the MEG Transfer Pump:</w:t>
-      </w:r>
-    </w:p>
-    <w:p>
-      <w:pPr>
-        <w:pStyle w:val="ListBullet"/>
-      </w:pPr>
-      <w:r>
-        <w:t xml:space="preserve">  Flow Rates:</w:t>
-      </w:r>
-    </w:p>
-    <w:p>
-      <w:pPr>
-        <w:pStyle w:val="ListBullet"/>
-      </w:pPr>
-      <w:r>
-        <w:t xml:space="preserve">  Normal Flow: 45 m³/h</w:t>
-      </w:r>
-    </w:p>
-    <w:p>
-      <w:pPr>
-        <w:pStyle w:val="ListBullet"/>
-      </w:pPr>
-      <w:r>
-        <w:t xml:space="preserve">  Rated Flow: 54.0 m³/h (20% margin applied to normal flow)</w:t>
-      </w:r>
-    </w:p>
-    <w:p>
-      <w:pPr>
-        <w:pStyle w:val="ListBullet"/>
-      </w:pPr>
-      <w:r>
-        <w:t xml:space="preserve">  Source: 4-PDS-XXXX-R1 (Template Brine Ion Exchange Pkg).xls</w:t>
-      </w:r>
-    </w:p>
-    <w:p>
-      <w:pPr>
-        <w:pStyle w:val="ListBullet"/>
-      </w:pPr>
-      <w:r>
-        <w:t xml:space="preserve">  Design Pressure: 10 bar (PN10)</w:t>
-      </w:r>
-    </w:p>
-    <w:p>
-      <w:pPr>
-        <w:pStyle w:val="ListBullet"/>
-      </w:pPr>
-      <w:r>
-        <w:t xml:space="preserve">  Source: RAG / 1-PRC-0001</w:t>
-      </w:r>
-    </w:p>
-    <w:p>
-      <w:pPr>
-        <w:pStyle w:val="ListBullet"/>
-      </w:pPr>
-      <w:r>
-        <w:t xml:space="preserve">  Corrosion Allowance: 1.5 mm</w:t>
-      </w:r>
-    </w:p>
-    <w:p>
-      <w:pPr>
-        <w:pStyle w:val="ListBullet"/>
-      </w:pPr>
-      <w:r>
-        <w:t xml:space="preserve">  Source: 5-LST-0003</w:t>
-      </w:r>
-    </w:p>
-    <w:p>
-      <w:pPr>
-        <w:pStyle w:val="ListBullet"/>
-      </w:pPr>
-      <w:r>
-        <w:t xml:space="preserve">  Material Selection: Material selection shall be based on the corrosive nature of the fluid. While no specific corrosive material requirement from 4-SPC-0001 is triggered (as no corrosive fluid flag is active in that system), the fluid property "Corrosive: True" from 1-LST-0002 dictates the need for corrosion-resistant materials. Reference examples from 5-LST-0003 (e.g., Cr-Mo steel, 316L Stainless Steel, FRP) should be considered.</w:t>
-      </w:r>
-    </w:p>
-    <w:p>
-      <w:pPr>
-        <w:pStyle w:val="ListBullet"/>
-      </w:pPr>
-      <w:r>
-        <w:t xml:space="preserve">  Pressure Testing: A mandatory hydrostatic test is not explicitly required by the 'high_pressure' flag (as it is not active). However, hydrostatic testing is a common and recommended practice for process equipment, as exemplified in 5-LST-0003, and should be performed.</w:t>
-      </w:r>
-    </w:p>
-    <w:p>
-      <w:pPr>
-        <w:pStyle w:val="ListBullet"/>
-      </w:pPr>
-      <w:r>
-        <w:t xml:space="preserve">  Source: RAG / 1-PRC-0001, 5-LST-0003</w:t>
-      </w:r>
-    </w:p>
-    <w:p>
-      <w:pPr>
-        <w:pStyle w:val="Heading3"/>
-      </w:pPr>
-      <w:r>
-        <w:t>4. Hydraulic Calculation</w:t>
-      </w:r>
-    </w:p>
-    <w:p>
-      <w:r>
-        <w:t>The following hydraulic parameters have been calculated for the pump at rated flow:</w:t>
-      </w:r>
-    </w:p>
-    <w:p>
-      <w:pPr>
-        <w:pStyle w:val="ListBullet"/>
-      </w:pPr>
-      <w:r>
-        <w:t xml:space="preserve">  Total Dynamic Head (TDH) Breakdown:</w:t>
-      </w:r>
-    </w:p>
-    <w:p>
-      <w:pPr>
-        <w:pStyle w:val="ListBullet"/>
-      </w:pPr>
-      <w:r>
-        <w:t xml:space="preserve">  Pressure Differential Head: 15.8 m</w:t>
-      </w:r>
-    </w:p>
-    <w:p>
-      <w:pPr>
-        <w:pStyle w:val="ListBullet"/>
-      </w:pPr>
-      <w:r>
-        <w:t xml:space="preserve">  Static Head: 5.0 m</w:t>
-      </w:r>
-    </w:p>
-    <w:p>
-      <w:pPr>
-        <w:pStyle w:val="ListBullet"/>
-      </w:pPr>
-      <w:r>
-        <w:t xml:space="preserve">  Friction Losses: 3.3 m</w:t>
-      </w:r>
-    </w:p>
-    <w:p>
-      <w:pPr>
-        <w:pStyle w:val="ListBullet"/>
-      </w:pPr>
-      <w:r>
-        <w:t xml:space="preserve">  Calculated TDH: 24.1 m</w:t>
-      </w:r>
-    </w:p>
-    <w:p>
-      <w:pPr>
-        <w:pStyle w:val="ListBullet"/>
-      </w:pPr>
-      <w:r>
-        <w:t xml:space="preserve">  Net Positive Suction Head Available (NPSHa): 25.6 m</w:t>
-      </w:r>
-    </w:p>
-    <w:p>
-      <w:pPr>
-        <w:pStyle w:val="ListBullet"/>
-      </w:pPr>
-      <w:r>
-        <w:t xml:space="preserve">  Notes: None</w:t>
-      </w:r>
-    </w:p>
-    <w:p>
-      <w:pPr>
-        <w:pStyle w:val="Heading3"/>
-      </w:pPr>
-      <w:r>
-        <w:t>5. Risk Considerations</w:t>
-      </w:r>
-    </w:p>
-    <w:p>
-      <w:pPr>
-        <w:pStyle w:val="ListBullet"/>
-      </w:pPr>
-      <w:r>
-        <w:t xml:space="preserve">  Active Risk Flags: None.</w:t>
-      </w:r>
-    </w:p>
-    <w:p>
-      <w:pPr>
-        <w:pStyle w:val="ListBullet"/>
-      </w:pPr>
-      <w:r>
-        <w:t xml:space="preserve">  Engineering Implications: The absence of active risk flags indicates that no specific, pre-defined project risks (e.g., 'high_pressure', 'corrosive_fluid_flag' from 4-SPC-0001) have been triggered by the system. This simplifies the design process by not requiring additional, flag-driven mitigation strategies or design reviews. However, the inherent corrosivity of MEG (as identified in fluid properties) remains a primary engineering consideration for material selection, independent of system flags.</w:t>
-      </w:r>
-    </w:p>
-    <w:p>
-      <w:pPr>
-        <w:pStyle w:val="Heading3"/>
-      </w:pPr>
-      <w:r>
-        <w:t>6. Handover to Mechanical Engineer</w:t>
-      </w:r>
-    </w:p>
-    <w:p>
-      <w:r>
-        <w:t>The following parameters are to be used by the Mechanical Engineer for pump selection, sizing, and skid design:</w:t>
-      </w:r>
-    </w:p>
-    <w:p>
-      <w:pPr>
-        <w:pStyle w:val="ListBullet"/>
-      </w:pPr>
-      <w:r>
-        <w:t xml:space="preserve">  Fluid: Monoethylene Glycol (MEG), 95% by weight</w:t>
-      </w:r>
-    </w:p>
-    <w:p>
-      <w:pPr>
-        <w:pStyle w:val="ListBullet"/>
-      </w:pPr>
-      <w:r>
-        <w:t xml:space="preserve">  Fluid Density: 1095 kg/m³</w:t>
-      </w:r>
-    </w:p>
-    <w:p>
-      <w:pPr>
-        <w:pStyle w:val="ListBullet"/>
-      </w:pPr>
-      <w:r>
-        <w:t xml:space="preserve">  Fluid Viscosity: 4.0 mPa·s</w:t>
-      </w:r>
-    </w:p>
-    <w:p>
-      <w:pPr>
-        <w:pStyle w:val="ListBullet"/>
-      </w:pPr>
-      <w:r>
-        <w:t xml:space="preserve">  Fluid Vapour Pressure (at 65°C): 0.5 kPa</w:t>
+        <w:t xml:space="preserve">  Operating Temperature (for Vapour Pressure): 65°C (Refer to P&amp;ID for full operating temperature range.)</w:t>
       </w:r>
     </w:p>
     <w:p>
@@ -407,7 +376,7 @@
         <w:pStyle w:val="ListBullet"/>
       </w:pPr>
       <w:r>
-        <w:t xml:space="preserve">  Material Selection Guidance: Pump and wetted components must be suitable for corrosive MEG service. Refer to 5-LST-0003 for examples of suitable materials (e.g., Cr-Mo steel, 316L Stainless Steel, FRP).</w:t>
+        <w:t xml:space="preserve">  Material Selection: Standard industrial materials suitable for non-corrosive MEG service.</w:t>
       </w:r>
     </w:p>
     <w:p>
@@ -415,7 +384,7 @@
         <w:pStyle w:val="ListBullet"/>
       </w:pPr>
       <w:r>
-        <w:t xml:space="preserve">  Pressure Testing: Hydrostatic testing of the pump and skid piping is recommended.</w:t>
+        <w:t xml:space="preserve">  Pressure Testing: Standard industrial pressure testing procedures.</w:t>
       </w:r>
     </w:p>
     <w:sectPr>

</xml_diff>

<commit_message>
feat: electrical engines + reusable calc xlsx template
- engines/: load_density (DPS density, cable/VD), load_itemized (IEC),
  transformer (short-circuit + loading), panelboard, cable_vd, refstd, db
  (SQLite + change propagation), ref_tables (dps/iec/cable_vd/panel_lv),
  fixtures, golden tests (159 passing)
- Nova electrical agent: runs load/transformer/panelboard, --change-room propagation
- export_xlsx: reusable 4-sheet electrical calc workbook (Cover/Load-Calc/
  Summary/Ref-Tables) with live formulas referencing Ref-Tables (877 kVA)
- server.js/Dashboard: electrical panels, cable/VD columns, propagation,
  missing-input hints; commercial_building catalog + full-discipline PM

Co-Authored-By: Claude Opus 4.8 (1M context) <noreply@anthropic.com>
</commit_message>
<xml_diff>
--- a/work_agents/Aria - Process Engineer/deliverables/1-CAL-XXXX.docx
+++ b/work_agents/Aria - Process Engineer/deliverables/1-CAL-XXXX.docx
@@ -17,7 +17,7 @@
     </w:p>
     <w:p>
       <w:r>
-        <w:t>Location: Sarnia, Ontario, Canada</w:t>
+        <w:t>Location: Sarnia, Canada</w:t>
       </w:r>
     </w:p>
     <w:p>
@@ -27,7 +27,7 @@
     </w:p>
     <w:p>
       <w:r>
-        <w:t>Prepared By: [Your Name/Process Engineer]</w:t>
+        <w:t>Document Ref: PCS-MEG-001-R0</w:t>
       </w:r>
     </w:p>
     <w:p>
@@ -40,7 +40,7 @@
     </w:p>
     <w:p>
       <w:r>
-        <w:t>This document summarizes the process calculations for the Monoethylene Glycol (MEG) Transfer Pump Skid at B Star Chemetics' Sarnia facility. It covers fluid properties, design criteria, hydraulic calculations, risk considerations, and key parameters for mechanical engineering handover, ensuring the pump is appropriately sized and specified for its intended service.</w:t>
+        <w:t>This document summarizes the process engineering calculations for the Monoethylene Glycol (MEG) Transfer Pump, part of the B Star Chemetics facility in Sarnia, Canada. The purpose of this pump is to transfer 95% by weight Monoethylene Glycol.</w:t>
       </w:r>
     </w:p>
     <w:p>
@@ -56,7 +56,7 @@
         <w:pStyle w:val="ListBullet"/>
       </w:pPr>
       <w:r>
-        <w:t xml:space="preserve">  Fluid: Monoethylene Glycol (MEG), 95% by weight</w:t>
+        <w:t xml:space="preserve">  Fluid Name: Monoethylene Glycol (MEG), 95% by weight</w:t>
       </w:r>
     </w:p>
     <w:p>
@@ -64,7 +64,7 @@
         <w:pStyle w:val="ListBullet"/>
       </w:pPr>
       <w:r>
-        <w:t xml:space="preserve">  Code: MEG</w:t>
+        <w:t xml:space="preserve">  Fluid Code: MEG (Source: RAG / 1-LST-0002)</w:t>
       </w:r>
     </w:p>
     <w:p>
@@ -72,12 +72,7 @@
         <w:pStyle w:val="ListBullet"/>
       </w:pPr>
       <w:r>
-        <w:t xml:space="preserve">  Source: RAG / 1-LST-0002 (estimated)</w:t>
-      </w:r>
-    </w:p>
-    <w:p>
-      <w:r>
-        <w:t>Fluid Properties:</w:t>
+        <w:t xml:space="preserve">  Key Properties:</w:t>
       </w:r>
     </w:p>
     <w:p>
@@ -85,7 +80,7 @@
         <w:pStyle w:val="ListBullet"/>
       </w:pPr>
       <w:r>
-        <w:t xml:space="preserve">  Density: 1095 kg/m³ (Specific Gravity: 1.095)</w:t>
+        <w:t xml:space="preserve">  Density: 1095 kg/m³</w:t>
       </w:r>
     </w:p>
     <w:p>
@@ -93,7 +88,7 @@
         <w:pStyle w:val="ListBullet"/>
       </w:pPr>
       <w:r>
-        <w:t xml:space="preserve">  Viscosity: 2.5 mPa·s</w:t>
+        <w:t xml:space="preserve">  Specific Gravity (SG): 1.095</w:t>
       </w:r>
     </w:p>
     <w:p>
@@ -101,7 +96,7 @@
         <w:pStyle w:val="ListBullet"/>
       </w:pPr>
       <w:r>
-        <w:t xml:space="preserve">  Vapour Pressure at 65°C: 0.2 kPa</w:t>
+        <w:t xml:space="preserve">  Viscosity: 4.0 mPa·s</w:t>
       </w:r>
     </w:p>
     <w:p>
@@ -109,17 +104,55 @@
         <w:pStyle w:val="ListBullet"/>
       </w:pPr>
       <w:r>
-        <w:t xml:space="preserve">  Corrosive: False</w:t>
+        <w:t xml:space="preserve">  Vapour Pressure at 65°C: 0.15 kPa</w:t>
       </w:r>
     </w:p>
     <w:p>
+      <w:pPr>
+        <w:pStyle w:val="ListBullet"/>
+      </w:pPr>
       <w:r>
-        <w:t>Engineering Significance:</w:t>
+        <w:t xml:space="preserve">  Corrosive: True (Source: RAG / 1-LST-0002)</w:t>
       </w:r>
     </w:p>
     <w:p>
+      <w:pPr>
+        <w:pStyle w:val="ListBullet"/>
+      </w:pPr>
       <w:r>
-        <w:t>The fluid's density is critical for converting head to pressure and for power calculations. The low viscosity (2.5 mPa·s) indicates that standard centrifugal pumps are suitable without significant derating due to viscous effects. The low vapour pressure (0.2 kPa at 65°C) is favorable for Net Positive Suction Head Available (NPSHa) calculations, minimizing the risk of cavitation. The non-corrosive nature simplifies material selection, allowing for standard industrial materials.</w:t>
+        <w:t xml:space="preserve">  Engineering Significance:</w:t>
+      </w:r>
+    </w:p>
+    <w:p>
+      <w:pPr>
+        <w:pStyle w:val="ListBullet"/>
+      </w:pPr>
+      <w:r>
+        <w:t xml:space="preserve">  The high density (1095 kg/m³) is critical for converting pump head to discharge pressure and for power calculations.</w:t>
+      </w:r>
+    </w:p>
+    <w:p>
+      <w:pPr>
+        <w:pStyle w:val="ListBullet"/>
+      </w:pPr>
+      <w:r>
+        <w:t xml:space="preserve">  The low viscosity (4.0 mPa·s) indicates that standard centrifugal pump selection criteria apply, with minimal impact on pump efficiency or friction losses due to viscosity.</w:t>
+      </w:r>
+    </w:p>
+    <w:p>
+      <w:pPr>
+        <w:pStyle w:val="ListBullet"/>
+      </w:pPr>
+      <w:r>
+        <w:t xml:space="preserve">  The low vapour pressure (0.15 kPa at 65°C) is favorable for NPSH availability, reducing the risk of cavitation.</w:t>
+      </w:r>
+    </w:p>
+    <w:p>
+      <w:pPr>
+        <w:pStyle w:val="ListBullet"/>
+      </w:pPr>
+      <w:r>
+        <w:t xml:space="preserve">  The fluid is identified as "Corrosive: True." This is a critical factor for material selection, despite other design criteria suggesting non-corrosive service (see Section 5).</w:t>
       </w:r>
     </w:p>
     <w:p>
@@ -128,6 +161,11 @@
       </w:pPr>
       <w:r>
         <w:t>3. Design Criteria Summary</w:t>
+      </w:r>
+    </w:p>
+    <w:p>
+      <w:r>
+        <w:t>The following design criteria were applied for the MEG Transfer Pump:</w:t>
       </w:r>
     </w:p>
     <w:p>
@@ -143,7 +181,7 @@
         <w:pStyle w:val="ListBullet"/>
       </w:pPr>
       <w:r>
-        <w:t xml:space="preserve">  Rated Flow: 54.0 m³/h (A 20% margin has been applied to the normal flow to determine the rated flow.)</w:t>
+        <w:t xml:space="preserve">  Rated Flow: 54.0 m³/h (This includes a 20% margin over normal flow, as per 4-PDS-XXXX-R1 (Template Brine Ion Exchange Pkg).xls)</w:t>
       </w:r>
     </w:p>
     <w:p>
@@ -151,7 +189,7 @@
         <w:pStyle w:val="ListBullet"/>
       </w:pPr>
       <w:r>
-        <w:t xml:space="preserve">  Source for margin: 4-PDS-XXXX-R1 (Template Brine Ion Exchange Pkg).xls</w:t>
+        <w:t xml:space="preserve">  Design Pressure: 10 bar (PN10 rating)</w:t>
       </w:r>
     </w:p>
     <w:p>
@@ -159,7 +197,7 @@
         <w:pStyle w:val="ListBullet"/>
       </w:pPr>
       <w:r>
-        <w:t xml:space="preserve">  Design Pressure: 10 bar (PN10)</w:t>
+        <w:t xml:space="preserve">  Corrosion Allowance: 0 mm (Source: 5-LST-0003-2)</w:t>
       </w:r>
     </w:p>
     <w:p>
@@ -167,7 +205,7 @@
         <w:pStyle w:val="ListBullet"/>
       </w:pPr>
       <w:r>
-        <w:t xml:space="preserve">  Corrosion Allowance: 1.5 mm</w:t>
+        <w:t xml:space="preserve">  Material Selection Basis: Standard practice for non-corrosive service (Source: 5-LST-0003-2). Note: This contradicts the fluid property stating "Corrosive: True." This discrepancy is highlighted in Section 5.</w:t>
       </w:r>
     </w:p>
     <w:p>
@@ -175,31 +213,7 @@
         <w:pStyle w:val="ListBullet"/>
       </w:pPr>
       <w:r>
-        <w:t xml:space="preserve">  Source for corrosion allowance: 5-LST-0003</w:t>
-      </w:r>
-    </w:p>
-    <w:p>
-      <w:pPr>
-        <w:pStyle w:val="ListBullet"/>
-      </w:pPr>
-      <w:r>
-        <w:t xml:space="preserve">  Material Requirements: No specific corrosive material requirement is indicated, as the 'corrosive_fluid' flag is not active. Standard materials suitable for MEG are acceptable.</w:t>
-      </w:r>
-    </w:p>
-    <w:p>
-      <w:pPr>
-        <w:pStyle w:val="ListBullet"/>
-      </w:pPr>
-      <w:r>
-        <w:t xml:space="preserve">  Pressure Test Requirements: No mandatory hydrostatic test requirement is indicated, as the 'high_pressure' flag is not active.</w:t>
-      </w:r>
-    </w:p>
-    <w:p>
-      <w:pPr>
-        <w:pStyle w:val="ListBullet"/>
-      </w:pPr>
-      <w:r>
-        <w:t xml:space="preserve">  Source for design criteria: RAG / 1-PRC-0001</w:t>
+        <w:t xml:space="preserve">  Pressure Test: Standard pressure testing procedures apply.</w:t>
       </w:r>
     </w:p>
     <w:p>
@@ -212,7 +226,7 @@
     </w:p>
     <w:p>
       <w:r>
-        <w:t>Total Dynamic Head (TDH) Breakdown:</w:t>
+        <w:t>The hydraulic calculations for the MEG Transfer Pump resulted in the following:</w:t>
       </w:r>
     </w:p>
     <w:p>
@@ -228,7 +242,7 @@
         <w:pStyle w:val="ListBullet"/>
       </w:pPr>
       <w:r>
-        <w:t xml:space="preserve">  Static Head: 5 m</w:t>
+        <w:t xml:space="preserve">  Static Head: 5.0 m</w:t>
       </w:r>
     </w:p>
     <w:p>
@@ -244,12 +258,7 @@
         <w:pStyle w:val="ListBullet"/>
       </w:pPr>
       <w:r>
-        <w:t xml:space="preserve">  Total Dynamic Head (TDH): 24.1 m</w:t>
-      </w:r>
-    </w:p>
-    <w:p>
-      <w:r>
-        <w:t>Net Positive Suction Head Available (NPSHa):</w:t>
+        <w:t xml:space="preserve">  Total Dynamic Head (TDH): 24.1 m (Sum of pressure differential, static, and friction heads)</w:t>
       </w:r>
     </w:p>
     <w:p>
@@ -257,12 +266,15 @@
         <w:pStyle w:val="ListBullet"/>
       </w:pPr>
       <w:r>
-        <w:t xml:space="preserve">  NPSHa: 25.6 m</w:t>
+        <w:t xml:space="preserve">  Net Positive Suction Head Available (NPSHa): 25.6 m</w:t>
       </w:r>
     </w:p>
     <w:p>
+      <w:pPr>
+        <w:pStyle w:val="ListBullet"/>
+      </w:pPr>
       <w:r>
-        <w:t>Notes: No specific notes or unusual conditions were identified during the hydraulic calculation.</w:t>
+        <w:t xml:space="preserve">  Notes: No specific notes were provided with the hydraulic results.</w:t>
       </w:r>
     </w:p>
     <w:p>
@@ -274,8 +286,45 @@
       </w:r>
     </w:p>
     <w:p>
+      <w:pPr>
+        <w:pStyle w:val="ListBullet"/>
+      </w:pPr>
       <w:r>
-        <w:t>No active risk flags were identified for this project based on the provided data. This implies that no specific engineering mitigations (e.g., special material requirements for corrosion, specific high-pressure testing protocols, or unique safety interlocks) are triggered by inherent fluid properties or operating conditions beyond standard industrial practices.</w:t>
+        <w:t xml:space="preserve">  Active Risk Flags: None were provided as active for this project.</w:t>
+      </w:r>
+    </w:p>
+    <w:p>
+      <w:pPr>
+        <w:pStyle w:val="ListBullet"/>
+      </w:pPr>
+      <w:r>
+        <w:t xml:space="preserve">  Identified Discrepancy / Engineering Implication:</w:t>
+      </w:r>
+    </w:p>
+    <w:p>
+      <w:r>
+        <w:t>A significant discrepancy has been identified between the fluid properties and the design criteria regarding corrosion.</w:t>
+      </w:r>
+    </w:p>
+    <w:p>
+      <w:pPr>
+        <w:pStyle w:val="ListBullet"/>
+      </w:pPr>
+      <w:r>
+        <w:t xml:space="preserve">  Fluid properties state: "Corrosive: True."</w:t>
+      </w:r>
+    </w:p>
+    <w:p>
+      <w:pPr>
+        <w:pStyle w:val="ListBullet"/>
+      </w:pPr>
+      <w:r>
+        <w:t xml:space="preserve">  Design criteria state: "Corrosion allowance: 0 mm" and "Material selection based on standard practice for non-corrosive service."</w:t>
+      </w:r>
+    </w:p>
+    <w:p>
+      <w:r>
+        <w:t>This contradiction presents a critical risk. If MEG is indeed corrosive, selecting materials based on non-corrosive service and applying zero corrosion allowance could lead to premature equipment failure, leaks, safety hazards, and significant operational downtime. This requires immediate clarification and resolution with the client and relevant stakeholders (e.g., Materials Engineer, Project Manager).</w:t>
       </w:r>
     </w:p>
     <w:p>
@@ -288,7 +337,7 @@
     </w:p>
     <w:p>
       <w:r>
-        <w:t>The following parameters are to be used by the Mechanical Engineer for the selection and design of the MEG Transfer Pump:</w:t>
+        <w:t>The following parameters are to be used by the Mechanical Engineer for the selection and sizing of the MEG Transfer Pump:</w:t>
       </w:r>
     </w:p>
     <w:p>
@@ -296,39 +345,7 @@
         <w:pStyle w:val="ListBullet"/>
       </w:pPr>
       <w:r>
-        <w:t xml:space="preserve">  Fluid: Monoethylene Glycol (MEG)</w:t>
-      </w:r>
-    </w:p>
-    <w:p>
-      <w:pPr>
-        <w:pStyle w:val="ListBullet"/>
-      </w:pPr>
-      <w:r>
-        <w:t xml:space="preserve">  Density: 1095 kg/m³</w:t>
-      </w:r>
-    </w:p>
-    <w:p>
-      <w:pPr>
-        <w:pStyle w:val="ListBullet"/>
-      </w:pPr>
-      <w:r>
-        <w:t xml:space="preserve">  Viscosity: 2.5 mPa·s</w:t>
-      </w:r>
-    </w:p>
-    <w:p>
-      <w:pPr>
-        <w:pStyle w:val="ListBullet"/>
-      </w:pPr>
-      <w:r>
-        <w:t xml:space="preserve">  Vapour Pressure: 0.2 kPa (at 65°C)</w:t>
-      </w:r>
-    </w:p>
-    <w:p>
-      <w:pPr>
-        <w:pStyle w:val="ListBullet"/>
-      </w:pPr>
-      <w:r>
-        <w:t xml:space="preserve">  Operating Temperature (for Vapour Pressure): 65°C (Refer to P&amp;ID for full operating temperature range.)</w:t>
+        <w:t xml:space="preserve">  Fluid: Monoethylene Glycol (MEG), 95% by weight</w:t>
       </w:r>
     </w:p>
     <w:p>
@@ -352,7 +369,31 @@
         <w:pStyle w:val="ListBullet"/>
       </w:pPr>
       <w:r>
-        <w:t xml:space="preserve">  Net Positive Suction Head Available (NPSHa): 25.6 m</w:t>
+        <w:t xml:space="preserve">  NPSH Available (NPSHa): 25.6 m</w:t>
+      </w:r>
+    </w:p>
+    <w:p>
+      <w:pPr>
+        <w:pStyle w:val="ListBullet"/>
+      </w:pPr>
+      <w:r>
+        <w:t xml:space="preserve">  Fluid Density: 1095 kg/m³</w:t>
+      </w:r>
+    </w:p>
+    <w:p>
+      <w:pPr>
+        <w:pStyle w:val="ListBullet"/>
+      </w:pPr>
+      <w:r>
+        <w:t xml:space="preserve">  Fluid Viscosity: 4.0 mPa·s</w:t>
+      </w:r>
+    </w:p>
+    <w:p>
+      <w:pPr>
+        <w:pStyle w:val="ListBullet"/>
+      </w:pPr>
+      <w:r>
+        <w:t xml:space="preserve">  Vapour Pressure (at 65°C): 0.15 kPa (Consider 65°C as a key operating/design temperature for NPSH calculations)</w:t>
       </w:r>
     </w:p>
     <w:p>
@@ -368,7 +409,7 @@
         <w:pStyle w:val="ListBullet"/>
       </w:pPr>
       <w:r>
-        <w:t xml:space="preserve">  Corrosion Allowance: 1.5 mm</w:t>
+        <w:t xml:space="preserve">  Corrosion Allowance: 0 mm. CRITICAL NOTE: This value is provided in the design criteria but contradicts the fluid property stating "Corrosive: True." Material selection must be confirmed to be suitable for corrosive MEG service, or the "Corrosive: True" property must be formally revised.</w:t>
       </w:r>
     </w:p>
     <w:p>
@@ -376,15 +417,7 @@
         <w:pStyle w:val="ListBullet"/>
       </w:pPr>
       <w:r>
-        <w:t xml:space="preserve">  Material Selection: Standard industrial materials suitable for non-corrosive MEG service.</w:t>
-      </w:r>
-    </w:p>
-    <w:p>
-      <w:pPr>
-        <w:pStyle w:val="ListBullet"/>
-      </w:pPr>
-      <w:r>
-        <w:t xml:space="preserve">  Pressure Testing: Standard industrial pressure testing procedures.</w:t>
+        <w:t xml:space="preserve">  Material Selection Guidance: Based on "standard practice for non-corrosive service." CRITICAL NOTE: As above, this contradicts the fluid property "Corrosive: True." Mechanical Engineer must seek clarification and ensure materials are appropriate for the actual corrosivity of 95% MEG.</w:t>
       </w:r>
     </w:p>
     <w:sectPr>

</xml_diff>